<commit_message>
Clean sweep 2e: every download, docx, and export rebuilt from the cleaned markdown
</commit_message>
<xml_diff>
--- a/downloads/student/Unit 00/Handout 00.05 - Room and Lab Agreement.docx
+++ b/downloads/student/Unit 00/Handout 00.05 - Room and Lab Agreement.docx
@@ -131,7 +131,7 @@
         <w:pStyle w:val="Compact"/>
       </w:pPr>
       <w:r>
-        <w:t xml:space="preserve">When the fire alarm goes, everything stops where it is. We leave by the exit on the map and meet at.</w:t>
+        <w:t xml:space="preserve">When the fire alarm goes, everything stops where it is. We leave by the exit on the map and meet at the spot we walked to on the room tour.</w:t>
       </w:r>
     </w:p>
     <w:p>
@@ -419,7 +419,7 @@
         <w:pStyle w:val="Compact"/>
       </w:pPr>
       <w:r>
-        <w:t xml:space="preserve">The nurse’s allergy list for this room says we do not bring in:. Not for a lab, not for a snack, not for a birthday.</w:t>
+        <w:t xml:space="preserve">The nurse’s allergy list for this room says we do not bring in: ____________________. Not for a lab, not for a snack, not for a birthday.</w:t>
       </w:r>
     </w:p>
     <w:p>
@@ -789,7 +789,7 @@
         <w:pStyle w:val="Compact"/>
       </w:pPr>
       <w:r>
-        <w:t xml:space="preserve">English: This paper explains how the Family and Consumer Sciences room runs (safety, respect, roles, clean up, phones, food and allergies, and what happens when a rule is broken). Your student helped write it and signed it. Your signature is optional. Questions:.</w:t>
+        <w:t xml:space="preserve">English: This paper explains how the Family and Consumer Sciences room runs (safety, respect, roles, clean up, phones, food and allergies, and what happens when a rule is broken). Your student helped write it and signed it. Your signature is optional. If you have questions, ask Mr. Prevosto.</w:t>
       </w:r>
     </w:p>
     <w:p>
@@ -801,7 +801,7 @@
         <w:pStyle w:val="Compact"/>
       </w:pPr>
       <w:r>
-        <w:t xml:space="preserve">Türkçe: Bu kağıt, Aile ve Tüketici Bilimleri sınıfının nasıl işlediğini açıklar (güvenlik, saygı, görevler, temizlik, telefonlar, yiyecek ve alerjiler ve bir kural bozulduğunda ne olacağı). Öğrenciniz bu kuralların yazılmasına yardım etti ve imzaladı. İmzanız isteğe bağlıdır. Sorular için:.</w:t>
+        <w:t xml:space="preserve">Türkçe: Bu kağıt, Aile ve Tüketici Bilimleri sınıfının nasıl işlediğini açıklar (güvenlik, saygı, görevler, temizlik, telefonlar, yiyecek ve alerjiler ve bir kural bozulduğunda ne olacağı). Öğrenciniz bu kuralların yazılmasına yardım etti ve imzaladı. İmzanız isteğe bağlıdır. Sorularınız için Bay Prevosto’ya ulaşabilirsiniz.</w:t>
       </w:r>
     </w:p>
     <w:p>
@@ -813,7 +813,7 @@
         <w:pStyle w:val="Compact"/>
       </w:pPr>
       <w:r>
-        <w:t xml:space="preserve">Português: Este papel explica como funciona a sala de Ciências da Família e do Consumidor (segurança, respeito, funções, limpeza, celulares, comida e alergias, e o que acontece quando uma regra é quebrada). Seu filho ou filha ajudou a escrever e assinou. Sua assinatura é opcional. Dúvidas:.</w:t>
+        <w:t xml:space="preserve">Português: Este papel explica como funciona a sala de Ciências da Família e do Consumidor (segurança, respeito, funções, limpeza, celulares, comida e alergias, e o que acontece quando uma regra é quebrada). Seu filho ou filha ajudou a escrever e assinou. Sua assinatura é opcional. Em caso de dúvidas, fale com o Sr. Prevosto.</w:t>
       </w:r>
     </w:p>
     <w:p>
@@ -825,7 +825,7 @@
         <w:pStyle w:val="Compact"/>
       </w:pPr>
       <w:r>
-        <w:t xml:space="preserve">Español: Este papel explica cómo funciona el salón de Ciencias de la Familia y del Consumidor (seguridad, respeto, roles, limpieza, teléfonos, comida y alergias, y qué pasa cuando se rompe una regla). Su hijo o hija ayudó a escribirlo y lo firmó. Su firma es opcional. Preguntas:.</w:t>
+        <w:t xml:space="preserve">Español: Este papel explica cómo funciona el salón de Ciencias de la Familia y del Consumidor (seguridad, respeto, roles, limpieza, teléfonos, comida y alergias, y qué pasa cuando se rompe una regla). Su hijo o hija ayudó a escribirlo y lo firmó. Su firma es opcional. Si tiene preguntas, hable con el Sr. Prevosto.</w:t>
       </w:r>
     </w:p>
     <w:sectPr>

</xml_diff>